<commit_message>
Atualização do Guia de Aprendizagem: ajuste de template, correção de typo e inclusão de modelos docx no git
</commit_message>
<xml_diff>
--- a/docOrientadores/MODELO DE PLANO DE AULA- EFAPE.docx
+++ b/docOrientadores/MODELO DE PLANO DE AULA- EFAPE.docx
@@ -116,54 +116,6 @@
                           <a:xfrm>
                             <a:off x="0" y="0"/>
                             <a:ext cx="668020" cy="636270"/>
-                          </a:xfrm>
-                          <a:prstGeom prst="rect">
-                            <a:avLst/>
-                          </a:prstGeom>
-                          <a:ln/>
-                        </pic:spPr>
-                      </pic:pic>
-                    </a:graphicData>
-                  </a:graphic>
-                </wp:anchor>
-              </w:drawing>
-            </w:r>
-            <w:r>
-              <w:rPr>
-                <w:noProof/>
-              </w:rPr>
-              <w:drawing>
-                <wp:anchor distT="0" distB="0" distL="114300" distR="114300" simplePos="0" relativeHeight="251659264" behindDoc="0" locked="0" layoutInCell="1" hidden="0" allowOverlap="1" wp14:anchorId="0DBCF460" wp14:editId="24F7BACD">
-                  <wp:simplePos x="0" y="0"/>
-                  <wp:positionH relativeFrom="column">
-                    <wp:posOffset>36196</wp:posOffset>
-                  </wp:positionH>
-                  <wp:positionV relativeFrom="paragraph">
-                    <wp:posOffset>6985</wp:posOffset>
-                  </wp:positionV>
-                  <wp:extent cx="810895" cy="621030"/>
-                  <wp:effectExtent l="0" t="0" r="0" b="0"/>
-                  <wp:wrapNone/>
-                  <wp:docPr id="2" name="image2.jpg"/>
-                  <wp:cNvGraphicFramePr/>
-                  <a:graphic xmlns:a="http://schemas.openxmlformats.org/drawingml/2006/main">
-                    <a:graphicData uri="http://schemas.openxmlformats.org/drawingml/2006/picture">
-                      <pic:pic xmlns:pic="http://schemas.openxmlformats.org/drawingml/2006/picture">
-                        <pic:nvPicPr>
-                          <pic:cNvPr id="0" name="image2.jpg"/>
-                          <pic:cNvPicPr preferRelativeResize="0"/>
-                        </pic:nvPicPr>
-                        <pic:blipFill>
-                          <a:blip r:embed="rId5"/>
-                          <a:srcRect/>
-                          <a:stretch>
-                            <a:fillRect/>
-                          </a:stretch>
-                        </pic:blipFill>
-                        <pic:spPr>
-                          <a:xfrm>
-                            <a:off x="0" y="0"/>
-                            <a:ext cx="810895" cy="621030"/>
                           </a:xfrm>
                           <a:prstGeom prst="rect">
                             <a:avLst/>

</xml_diff>